<commit_message>
TC-146: added warning when searching for a formula without a style and removed font check on the formula. rewrote number search
</commit_message>
<xml_diff>
--- a/java-thesis-checker/src/test/resources/incorrect_formula.docx
+++ b/java-thesis-checker/src/test/resources/incorrect_formula.docx
@@ -567,6 +567,21 @@
           </m:eqArr>
         </m:oMath>
       </m:oMathPara>
+    </w:p>
+    <w:p>
+      <w:pPr>
+        <w:rPr>
+          <w:rFonts w:ascii="Times New Roman" w:hAnsi="Times New Roman"/>
+          <w:lang w:val="uk-UA"/>
+        </w:rPr>
+      </w:pPr>
+      <w:r>
+        <w:rPr>
+          <w:rFonts w:ascii="Times New Roman" w:hAnsi="Times New Roman"/>
+          <w:lang w:val="uk-UA"/>
+        </w:rPr>
+        <w:t xml:space="preserve">Швидкість тіла визначається за формулою V = S/t (1.4).</w:t>
+      </w:r>
     </w:p>
     <w:sectPr>
       <w:pgSz w:w="11906" w:h="16838"/>

</xml_diff>

<commit_message>
TC-146: Add formula number validation for unformatted formulas
</commit_message>
<xml_diff>
--- a/java-thesis-checker/src/test/resources/incorrect_formula.docx
+++ b/java-thesis-checker/src/test/resources/incorrect_formula.docx
@@ -540,28 +540,7 @@
                   <w:rFonts w:ascii="Cambria Math" w:eastAsiaTheme="majorEastAsia" w:hAnsi="Cambria Math" w:cstheme="majorBidi"/>
                   <w:lang w:val="en-US"/>
                 </w:rPr>
-                <m:t>#</m:t>
-              </m:r>
-              <m:r>
-                <w:rPr>
-                  <w:rFonts w:ascii="Cambria Math" w:eastAsiaTheme="majorEastAsia" w:hAnsi="Cambria Math" w:cstheme="majorBidi"/>
-                  <w:lang w:val="en-US"/>
-                </w:rPr>
-                <m:t>(1</m:t>
-              </m:r>
-              <m:r>
-                <w:rPr>
-                  <w:rFonts w:ascii="Cambria Math" w:eastAsiaTheme="majorEastAsia" w:hAnsi="Cambria Math" w:cstheme="majorBidi"/>
-                  <w:lang w:val="en-US"/>
-                </w:rPr>
-                <m:t>]</m:t>
-              </m:r>
-              <m:r>
-                <w:rPr>
-                  <w:rFonts w:ascii="Cambria Math" w:eastAsiaTheme="majorEastAsia" w:hAnsi="Cambria Math" w:cstheme="majorBidi"/>
-                  <w:lang w:val="en-US"/>
-                </w:rPr>
-                <m:t>3)</m:t>
+                <m:t>#(1]3)</m:t>
               </m:r>
             </m:e>
           </m:eqArr>
@@ -580,7 +559,21 @@
           <w:rFonts w:ascii="Times New Roman" w:hAnsi="Times New Roman"/>
           <w:lang w:val="uk-UA"/>
         </w:rPr>
-        <w:t xml:space="preserve">Швидкість тіла визначається за формулою V = S/t (1.4).</w:t>
+        <w:t>Швидкість тіла визначається за формулою V = S/t (1.</w:t>
+      </w:r>
+      <w:r>
+        <w:rPr>
+          <w:rFonts w:ascii="Times New Roman" w:hAnsi="Times New Roman"/>
+          <w:lang w:val="ru-RU"/>
+        </w:rPr>
+        <w:t>5</w:t>
+      </w:r>
+      <w:r>
+        <w:rPr>
+          <w:rFonts w:ascii="Times New Roman" w:hAnsi="Times New Roman"/>
+          <w:lang w:val="uk-UA"/>
+        </w:rPr>
+        <w:t>).</w:t>
       </w:r>
     </w:p>
     <w:sectPr>

</xml_diff>

<commit_message>
TC-146: added warning when searching for a formula without a style (#63)
* TC-146: added warning when searching for a formula without a style and removed font check on the formula. rewrote number search

* TC-146: rollback checking size of formula

* TC-146: Add formula number validation for unformatted formulas
</commit_message>
<xml_diff>
--- a/java-thesis-checker/src/test/resources/incorrect_formula.docx
+++ b/java-thesis-checker/src/test/resources/incorrect_formula.docx
@@ -540,33 +540,41 @@
                   <w:rFonts w:ascii="Cambria Math" w:eastAsiaTheme="majorEastAsia" w:hAnsi="Cambria Math" w:cstheme="majorBidi"/>
                   <w:lang w:val="en-US"/>
                 </w:rPr>
-                <m:t>#</m:t>
-              </m:r>
-              <m:r>
-                <w:rPr>
-                  <w:rFonts w:ascii="Cambria Math" w:eastAsiaTheme="majorEastAsia" w:hAnsi="Cambria Math" w:cstheme="majorBidi"/>
-                  <w:lang w:val="en-US"/>
-                </w:rPr>
-                <m:t>(1</m:t>
-              </m:r>
-              <m:r>
-                <w:rPr>
-                  <w:rFonts w:ascii="Cambria Math" w:eastAsiaTheme="majorEastAsia" w:hAnsi="Cambria Math" w:cstheme="majorBidi"/>
-                  <w:lang w:val="en-US"/>
-                </w:rPr>
-                <m:t>]</m:t>
-              </m:r>
-              <m:r>
-                <w:rPr>
-                  <w:rFonts w:ascii="Cambria Math" w:eastAsiaTheme="majorEastAsia" w:hAnsi="Cambria Math" w:cstheme="majorBidi"/>
-                  <w:lang w:val="en-US"/>
-                </w:rPr>
-                <m:t>3)</m:t>
+                <m:t>#(1]3)</m:t>
               </m:r>
             </m:e>
           </m:eqArr>
         </m:oMath>
       </m:oMathPara>
+    </w:p>
+    <w:p>
+      <w:pPr>
+        <w:rPr>
+          <w:rFonts w:ascii="Times New Roman" w:hAnsi="Times New Roman"/>
+          <w:lang w:val="uk-UA"/>
+        </w:rPr>
+      </w:pPr>
+      <w:r>
+        <w:rPr>
+          <w:rFonts w:ascii="Times New Roman" w:hAnsi="Times New Roman"/>
+          <w:lang w:val="uk-UA"/>
+        </w:rPr>
+        <w:t>Швидкість тіла визначається за формулою V = S/t (1.</w:t>
+      </w:r>
+      <w:r>
+        <w:rPr>
+          <w:rFonts w:ascii="Times New Roman" w:hAnsi="Times New Roman"/>
+          <w:lang w:val="ru-RU"/>
+        </w:rPr>
+        <w:t>5</w:t>
+      </w:r>
+      <w:r>
+        <w:rPr>
+          <w:rFonts w:ascii="Times New Roman" w:hAnsi="Times New Roman"/>
+          <w:lang w:val="uk-UA"/>
+        </w:rPr>
+        <w:t>).</w:t>
+      </w:r>
     </w:p>
     <w:sectPr>
       <w:pgSz w:w="11906" w:h="16838"/>

</xml_diff>